<commit_message>
modified:   docs/Serveurs 1/01 - Travaux/Travail pratique 1.md 	modified:   docs/Serveurs 1/Assets/Travaux/Travail pratique.docx
</commit_message>
<xml_diff>
--- a/docs/Serveurs 1/Assets/Travaux/Travail pratique.docx
+++ b/docs/Serveurs 1/Assets/Travaux/Travail pratique.docx
@@ -1,6 +1,6 @@
 
 <file path=word/document.xml><?xml version="1.0" encoding="utf-8"?>
-<w:document xmlns:wpc="http://schemas.microsoft.com/office/word/2010/wordprocessingCanvas" xmlns:cx="http://schemas.microsoft.com/office/drawing/2014/chartex" xmlns:cx1="http://schemas.microsoft.com/office/drawing/2015/9/8/chartex" xmlns:cx2="http://schemas.microsoft.com/office/drawing/2015/10/21/chartex" xmlns:cx3="http://schemas.microsoft.com/office/drawing/2016/5/9/chartex" xmlns:cx4="http://schemas.microsoft.com/office/drawing/2016/5/10/chartex" xmlns:cx5="http://schemas.microsoft.com/office/drawing/2016/5/11/chartex" xmlns:cx6="http://schemas.microsoft.com/office/drawing/2016/5/12/chartex" xmlns:cx7="http://schemas.microsoft.com/office/drawing/2016/5/13/chartex" xmlns:cx8="http://schemas.microsoft.com/office/drawing/2016/5/14/chartex" xmlns:mc="http://schemas.openxmlformats.org/markup-compatibility/2006" xmlns:aink="http://schemas.microsoft.com/office/drawing/2016/ink" xmlns:am3d="http://schemas.microsoft.com/office/drawing/2017/model3d" xmlns:o="urn:schemas-microsoft-com:office:office" xmlns:oel="http://schemas.microsoft.com/office/2019/extlst" xmlns:r="http://schemas.openxmlformats.org/officeDocument/2006/relationships" xmlns:m="http://schemas.openxmlformats.org/officeDocument/2006/math" xmlns:v="urn:schemas-microsoft-com:vml" xmlns:wp14="http://schemas.microsoft.com/office/word/2010/wordprocessingDrawing" xmlns:wp="http://schemas.openxmlformats.org/drawingml/2006/wordprocessingDrawing" xmlns:w10="urn:schemas-microsoft-com:office:word" xmlns:w="http://schemas.openxmlformats.org/wordprocessingml/2006/main" xmlns:w14="http://schemas.microsoft.com/office/word/2010/wordml" xmlns:w15="http://schemas.microsoft.com/office/word/2012/wordml" xmlns:w16cex="http://schemas.microsoft.com/office/word/2018/wordml/cex" xmlns:w16cid="http://schemas.microsoft.com/office/word/2016/wordml/cid" xmlns:w16="http://schemas.microsoft.com/office/word/2018/wordml" xmlns:w16du="http://schemas.microsoft.com/office/word/2023/wordml/word16du" xmlns:w16sdtdh="http://schemas.microsoft.com/office/word/2020/wordml/sdtdatahash" xmlns:w16se="http://schemas.microsoft.com/office/word/2015/wordml/symex" xmlns:wpg="http://schemas.microsoft.com/office/word/2010/wordprocessingGroup" xmlns:wpi="http://schemas.microsoft.com/office/word/2010/wordprocessingInk" xmlns:wne="http://schemas.microsoft.com/office/word/2006/wordml" xmlns:wps="http://schemas.microsoft.com/office/word/2010/wordprocessingShape" mc:Ignorable="w14 w15 w16se w16cid w16 w16cex w16sdtdh w16du wp14">
+<w:document xmlns:wpc="http://schemas.microsoft.com/office/word/2010/wordprocessingCanvas" xmlns:cx="http://schemas.microsoft.com/office/drawing/2014/chartex" xmlns:cx1="http://schemas.microsoft.com/office/drawing/2015/9/8/chartex" xmlns:cx2="http://schemas.microsoft.com/office/drawing/2015/10/21/chartex" xmlns:cx3="http://schemas.microsoft.com/office/drawing/2016/5/9/chartex" xmlns:cx4="http://schemas.microsoft.com/office/drawing/2016/5/10/chartex" xmlns:cx5="http://schemas.microsoft.com/office/drawing/2016/5/11/chartex" xmlns:cx6="http://schemas.microsoft.com/office/drawing/2016/5/12/chartex" xmlns:cx7="http://schemas.microsoft.com/office/drawing/2016/5/13/chartex" xmlns:cx8="http://schemas.microsoft.com/office/drawing/2016/5/14/chartex" xmlns:mc="http://schemas.openxmlformats.org/markup-compatibility/2006" xmlns:aink="http://schemas.microsoft.com/office/drawing/2016/ink" xmlns:am3d="http://schemas.microsoft.com/office/drawing/2017/model3d" xmlns:o="urn:schemas-microsoft-com:office:office" xmlns:oel="http://schemas.microsoft.com/office/2019/extlst" xmlns:r="http://schemas.openxmlformats.org/officeDocument/2006/relationships" xmlns:m="http://schemas.openxmlformats.org/officeDocument/2006/math" xmlns:v="urn:schemas-microsoft-com:vml" xmlns:wp14="http://schemas.microsoft.com/office/word/2010/wordprocessingDrawing" xmlns:wp="http://schemas.openxmlformats.org/drawingml/2006/wordprocessingDrawing" xmlns:w10="urn:schemas-microsoft-com:office:word" xmlns:w="http://schemas.openxmlformats.org/wordprocessingml/2006/main" xmlns:w14="http://schemas.microsoft.com/office/word/2010/wordml" xmlns:w15="http://schemas.microsoft.com/office/word/2012/wordml" xmlns:w16cex="http://schemas.microsoft.com/office/word/2018/wordml/cex" xmlns:w16cid="http://schemas.microsoft.com/office/word/2016/wordml/cid" xmlns:w16="http://schemas.microsoft.com/office/word/2018/wordml" xmlns:w16du="http://schemas.microsoft.com/office/word/2023/wordml/word16du" xmlns:w16sdtdh="http://schemas.microsoft.com/office/word/2020/wordml/sdtdatahash" xmlns:w16sdtfl="http://schemas.microsoft.com/office/word/2024/wordml/sdtformatlock" xmlns:w16se="http://schemas.microsoft.com/office/word/2015/wordml/symex" xmlns:wpg="http://schemas.microsoft.com/office/word/2010/wordprocessingGroup" xmlns:wpi="http://schemas.microsoft.com/office/word/2010/wordprocessingInk" xmlns:wne="http://schemas.microsoft.com/office/word/2006/wordml" xmlns:wps="http://schemas.microsoft.com/office/word/2010/wordprocessingShape" mc:Ignorable="w14 w15 w16se w16cid w16 w16cex w16sdtdh w16sdtfl w16du wp14">
   <w:body>
     <w:p>
       <w:pPr>
@@ -205,6 +205,7 @@
       </w:pPr>
       <w:r>
         <w:rPr>
+          <w:noProof/>
           <w:lang w:val="fr-CA"/>
         </w:rPr>
         <w:drawing>
@@ -283,6 +284,7 @@
       </w:pPr>
       <w:r>
         <w:rPr>
+          <w:noProof/>
           <w:lang w:val="fr-CA"/>
         </w:rPr>
         <w:drawing>
@@ -377,6 +379,7 @@
       </w:pPr>
       <w:r>
         <w:rPr>
+          <w:noProof/>
           <w:lang w:val="fr-CA"/>
         </w:rPr>
         <mc:AlternateContent>
@@ -526,6 +529,7 @@
       </w:pPr>
       <w:r>
         <w:rPr>
+          <w:noProof/>
           <w:lang w:val="fr-CA"/>
         </w:rPr>
         <w:lastRenderedPageBreak/>
@@ -670,6 +674,7 @@
       </w:pPr>
       <w:r>
         <w:rPr>
+          <w:noProof/>
           <w:lang w:val="fr-CA"/>
         </w:rPr>
         <mc:AlternateContent>
@@ -865,6 +870,7 @@
       </w:pPr>
       <w:r>
         <w:rPr>
+          <w:noProof/>
           <w:lang w:val="fr-CA"/>
         </w:rPr>
         <mc:AlternateContent>
@@ -927,23 +933,7 @@
                                 <w:iCs/>
                                 <w:lang w:val="fr-CA"/>
                               </w:rPr>
-                              <w:t>Répondez à la question #</w:t>
-                            </w:r>
-                            <w:r>
-                              <w:rPr>
-                                <w:i/>
-                                <w:iCs/>
-                                <w:lang w:val="fr-CA"/>
-                              </w:rPr>
-                              <w:t>3</w:t>
-                            </w:r>
-                            <w:r>
-                              <w:rPr>
-                                <w:i/>
-                                <w:iCs/>
-                                <w:lang w:val="fr-CA"/>
-                              </w:rPr>
-                              <w:t xml:space="preserve"> ici (preuves et texte)</w:t>
+                              <w:t>Répondez à la question #3 ici (preuves et texte)</w:t>
                             </w:r>
                           </w:p>
                         </w:txbxContent>
@@ -982,23 +972,7 @@
                           <w:iCs/>
                           <w:lang w:val="fr-CA"/>
                         </w:rPr>
-                        <w:t>Répondez à la question #</w:t>
-                      </w:r>
-                      <w:r>
-                        <w:rPr>
-                          <w:i/>
-                          <w:iCs/>
-                          <w:lang w:val="fr-CA"/>
-                        </w:rPr>
-                        <w:t>3</w:t>
-                      </w:r>
-                      <w:r>
-                        <w:rPr>
-                          <w:i/>
-                          <w:iCs/>
-                          <w:lang w:val="fr-CA"/>
-                        </w:rPr>
-                        <w:t xml:space="preserve"> ici (preuves et texte)</w:t>
+                        <w:t>Répondez à la question #3 ici (preuves et texte)</w:t>
                       </w:r>
                     </w:p>
                   </w:txbxContent>
@@ -1065,7 +1039,23 @@
           <w:bCs/>
           <w:lang w:val="fr-CA"/>
         </w:rPr>
-        <w:t>192.168.21.103.</w:t>
+        <w:t>192.168.21.1</w:t>
+      </w:r>
+      <w:r>
+        <w:rPr>
+          <w:b/>
+          <w:bCs/>
+          <w:lang w:val="fr-CA"/>
+        </w:rPr>
+        <w:t>1</w:t>
+      </w:r>
+      <w:r>
+        <w:rPr>
+          <w:b/>
+          <w:bCs/>
+          <w:lang w:val="fr-CA"/>
+        </w:rPr>
+        <w:t>3.</w:t>
       </w:r>
     </w:p>
     <w:p>
@@ -1096,6 +1086,7 @@
       </w:pPr>
       <w:r>
         <w:rPr>
+          <w:noProof/>
           <w:lang w:val="fr-CA"/>
         </w:rPr>
         <w:lastRenderedPageBreak/>
@@ -1159,23 +1150,7 @@
                                 <w:iCs/>
                                 <w:lang w:val="fr-CA"/>
                               </w:rPr>
-                              <w:t xml:space="preserve">Répondez à la question </w:t>
-                            </w:r>
-                            <w:r>
-                              <w:rPr>
-                                <w:i/>
-                                <w:iCs/>
-                                <w:lang w:val="fr-CA"/>
-                              </w:rPr>
-                              <w:t>#4</w:t>
-                            </w:r>
-                            <w:r>
-                              <w:rPr>
-                                <w:i/>
-                                <w:iCs/>
-                                <w:lang w:val="fr-CA"/>
-                              </w:rPr>
-                              <w:t xml:space="preserve"> ici (preuves et texte)</w:t>
+                              <w:t>Répondez à la question #4 ici (preuves et texte)</w:t>
                             </w:r>
                           </w:p>
                         </w:txbxContent>
@@ -1214,23 +1189,7 @@
                           <w:iCs/>
                           <w:lang w:val="fr-CA"/>
                         </w:rPr>
-                        <w:t xml:space="preserve">Répondez à la question </w:t>
-                      </w:r>
-                      <w:r>
-                        <w:rPr>
-                          <w:i/>
-                          <w:iCs/>
-                          <w:lang w:val="fr-CA"/>
-                        </w:rPr>
-                        <w:t>#4</w:t>
-                      </w:r>
-                      <w:r>
-                        <w:rPr>
-                          <w:i/>
-                          <w:iCs/>
-                          <w:lang w:val="fr-CA"/>
-                        </w:rPr>
-                        <w:t xml:space="preserve"> ici (preuves et texte)</w:t>
+                        <w:t>Répondez à la question #4 ici (preuves et texte)</w:t>
                       </w:r>
                     </w:p>
                   </w:txbxContent>
@@ -1317,6 +1276,7 @@
       </w:pPr>
       <w:r>
         <w:rPr>
+          <w:noProof/>
           <w:lang w:val="fr-CA"/>
         </w:rPr>
         <mc:AlternateContent>
@@ -1379,23 +1339,7 @@
                                 <w:iCs/>
                                 <w:lang w:val="fr-CA"/>
                               </w:rPr>
-                              <w:t>Répondez à la question #</w:t>
-                            </w:r>
-                            <w:r>
-                              <w:rPr>
-                                <w:i/>
-                                <w:iCs/>
-                                <w:lang w:val="fr-CA"/>
-                              </w:rPr>
-                              <w:t>5</w:t>
-                            </w:r>
-                            <w:r>
-                              <w:rPr>
-                                <w:i/>
-                                <w:iCs/>
-                                <w:lang w:val="fr-CA"/>
-                              </w:rPr>
-                              <w:t xml:space="preserve"> ici (preuves et texte)</w:t>
+                              <w:t>Répondez à la question #5 ici (preuves et texte)</w:t>
                             </w:r>
                           </w:p>
                         </w:txbxContent>
@@ -1434,23 +1378,7 @@
                           <w:iCs/>
                           <w:lang w:val="fr-CA"/>
                         </w:rPr>
-                        <w:t>Répondez à la question #</w:t>
-                      </w:r>
-                      <w:r>
-                        <w:rPr>
-                          <w:i/>
-                          <w:iCs/>
-                          <w:lang w:val="fr-CA"/>
-                        </w:rPr>
-                        <w:t>5</w:t>
-                      </w:r>
-                      <w:r>
-                        <w:rPr>
-                          <w:i/>
-                          <w:iCs/>
-                          <w:lang w:val="fr-CA"/>
-                        </w:rPr>
-                        <w:t xml:space="preserve"> ici (preuves et texte)</w:t>
+                        <w:t>Répondez à la question #5 ici (preuves et texte)</w:t>
                       </w:r>
                     </w:p>
                   </w:txbxContent>
@@ -1488,6 +1416,7 @@
       </w:pPr>
       <w:r>
         <w:rPr>
+          <w:noProof/>
           <w:lang w:val="fr-CA"/>
         </w:rPr>
         <mc:AlternateContent>
@@ -1644,6 +1573,7 @@
       </w:pPr>
       <w:r>
         <w:rPr>
+          <w:noProof/>
           <w:lang w:val="fr-CA"/>
         </w:rPr>
         <w:lastRenderedPageBreak/>
@@ -1707,23 +1637,7 @@
                                 <w:iCs/>
                                 <w:lang w:val="fr-CA"/>
                               </w:rPr>
-                              <w:t>Répondez à la question #</w:t>
-                            </w:r>
-                            <w:r>
-                              <w:rPr>
-                                <w:i/>
-                                <w:iCs/>
-                                <w:lang w:val="fr-CA"/>
-                              </w:rPr>
-                              <w:t>7</w:t>
-                            </w:r>
-                            <w:r>
-                              <w:rPr>
-                                <w:i/>
-                                <w:iCs/>
-                                <w:lang w:val="fr-CA"/>
-                              </w:rPr>
-                              <w:t xml:space="preserve"> ici (preuves et texte)</w:t>
+                              <w:t>Répondez à la question #7 ici (preuves et texte)</w:t>
                             </w:r>
                           </w:p>
                         </w:txbxContent>
@@ -1762,23 +1676,7 @@
                           <w:iCs/>
                           <w:lang w:val="fr-CA"/>
                         </w:rPr>
-                        <w:t>Répondez à la question #</w:t>
-                      </w:r>
-                      <w:r>
-                        <w:rPr>
-                          <w:i/>
-                          <w:iCs/>
-                          <w:lang w:val="fr-CA"/>
-                        </w:rPr>
-                        <w:t>7</w:t>
-                      </w:r>
-                      <w:r>
-                        <w:rPr>
-                          <w:i/>
-                          <w:iCs/>
-                          <w:lang w:val="fr-CA"/>
-                        </w:rPr>
-                        <w:t xml:space="preserve"> ici (preuves et texte)</w:t>
+                        <w:t>Répondez à la question #7 ici (preuves et texte)</w:t>
                       </w:r>
                     </w:p>
                   </w:txbxContent>
@@ -1847,6 +1745,7 @@
       </w:pPr>
       <w:r>
         <w:rPr>
+          <w:noProof/>
           <w:lang w:val="fr-CA"/>
         </w:rPr>
         <mc:AlternateContent>
@@ -1909,23 +1808,7 @@
                                 <w:iCs/>
                                 <w:lang w:val="fr-CA"/>
                               </w:rPr>
-                              <w:t>Répondez à la question #</w:t>
-                            </w:r>
-                            <w:r>
-                              <w:rPr>
-                                <w:i/>
-                                <w:iCs/>
-                                <w:lang w:val="fr-CA"/>
-                              </w:rPr>
-                              <w:t>8</w:t>
-                            </w:r>
-                            <w:r>
-                              <w:rPr>
-                                <w:i/>
-                                <w:iCs/>
-                                <w:lang w:val="fr-CA"/>
-                              </w:rPr>
-                              <w:t xml:space="preserve"> ici (preuves et texte)</w:t>
+                              <w:t>Répondez à la question #8 ici (preuves et texte)</w:t>
                             </w:r>
                           </w:p>
                         </w:txbxContent>
@@ -1964,23 +1847,7 @@
                           <w:iCs/>
                           <w:lang w:val="fr-CA"/>
                         </w:rPr>
-                        <w:t>Répondez à la question #</w:t>
-                      </w:r>
-                      <w:r>
-                        <w:rPr>
-                          <w:i/>
-                          <w:iCs/>
-                          <w:lang w:val="fr-CA"/>
-                        </w:rPr>
-                        <w:t>8</w:t>
-                      </w:r>
-                      <w:r>
-                        <w:rPr>
-                          <w:i/>
-                          <w:iCs/>
-                          <w:lang w:val="fr-CA"/>
-                        </w:rPr>
-                        <w:t xml:space="preserve"> ici (preuves et texte)</w:t>
+                        <w:t>Répondez à la question #8 ici (preuves et texte)</w:t>
                       </w:r>
                     </w:p>
                   </w:txbxContent>
@@ -2055,12 +1922,8 @@
       </w:pPr>
     </w:p>
     <w:sectPr>
-      <w:headerReference w:type="even" r:id="rId9"/>
-      <w:headerReference w:type="default" r:id="rId10"/>
-      <w:footerReference w:type="even" r:id="rId11"/>
-      <w:footerReference w:type="default" r:id="rId12"/>
-      <w:headerReference w:type="first" r:id="rId13"/>
-      <w:footerReference w:type="first" r:id="rId14"/>
+      <w:headerReference w:type="default" r:id="rId9"/>
+      <w:footerReference w:type="default" r:id="rId10"/>
       <w:pgSz w:w="12240" w:h="15840"/>
       <w:pgMar w:top="1440" w:right="1440" w:bottom="1440" w:left="1440" w:header="708" w:footer="708" w:gutter="0"/>
       <w:cols w:space="708"/>
@@ -2071,7 +1934,7 @@
 </file>
 
 <file path=word/endnotes.xml><?xml version="1.0" encoding="utf-8"?>
-<w:endnotes xmlns:wpc="http://schemas.microsoft.com/office/word/2010/wordprocessingCanvas" xmlns:cx="http://schemas.microsoft.com/office/drawing/2014/chartex" xmlns:cx1="http://schemas.microsoft.com/office/drawing/2015/9/8/chartex" xmlns:cx2="http://schemas.microsoft.com/office/drawing/2015/10/21/chartex" xmlns:cx3="http://schemas.microsoft.com/office/drawing/2016/5/9/chartex" xmlns:cx4="http://schemas.microsoft.com/office/drawing/2016/5/10/chartex" xmlns:cx5="http://schemas.microsoft.com/office/drawing/2016/5/11/chartex" xmlns:cx6="http://schemas.microsoft.com/office/drawing/2016/5/12/chartex" xmlns:cx7="http://schemas.microsoft.com/office/drawing/2016/5/13/chartex" xmlns:cx8="http://schemas.microsoft.com/office/drawing/2016/5/14/chartex" xmlns:mc="http://schemas.openxmlformats.org/markup-compatibility/2006" xmlns:aink="http://schemas.microsoft.com/office/drawing/2016/ink" xmlns:am3d="http://schemas.microsoft.com/office/drawing/2017/model3d" xmlns:o="urn:schemas-microsoft-com:office:office" xmlns:oel="http://schemas.microsoft.com/office/2019/extlst" xmlns:r="http://schemas.openxmlformats.org/officeDocument/2006/relationships" xmlns:m="http://schemas.openxmlformats.org/officeDocument/2006/math" xmlns:v="urn:schemas-microsoft-com:vml" xmlns:wp14="http://schemas.microsoft.com/office/word/2010/wordprocessingDrawing" xmlns:wp="http://schemas.openxmlformats.org/drawingml/2006/wordprocessingDrawing" xmlns:w10="urn:schemas-microsoft-com:office:word" xmlns:w="http://schemas.openxmlformats.org/wordprocessingml/2006/main" xmlns:w14="http://schemas.microsoft.com/office/word/2010/wordml" xmlns:w15="http://schemas.microsoft.com/office/word/2012/wordml" xmlns:w16cex="http://schemas.microsoft.com/office/word/2018/wordml/cex" xmlns:w16cid="http://schemas.microsoft.com/office/word/2016/wordml/cid" xmlns:w16="http://schemas.microsoft.com/office/word/2018/wordml" xmlns:w16du="http://schemas.microsoft.com/office/word/2023/wordml/word16du" xmlns:w16sdtdh="http://schemas.microsoft.com/office/word/2020/wordml/sdtdatahash" xmlns:w16se="http://schemas.microsoft.com/office/word/2015/wordml/symex" xmlns:wpg="http://schemas.microsoft.com/office/word/2010/wordprocessingGroup" xmlns:wpi="http://schemas.microsoft.com/office/word/2010/wordprocessingInk" xmlns:wne="http://schemas.microsoft.com/office/word/2006/wordml" xmlns:wps="http://schemas.microsoft.com/office/word/2010/wordprocessingShape" mc:Ignorable="w14 w15 w16se w16cid w16 w16cex w16sdtdh w16du wp14">
+<w:endnotes xmlns:wpc="http://schemas.microsoft.com/office/word/2010/wordprocessingCanvas" xmlns:cx="http://schemas.microsoft.com/office/drawing/2014/chartex" xmlns:cx1="http://schemas.microsoft.com/office/drawing/2015/9/8/chartex" xmlns:cx2="http://schemas.microsoft.com/office/drawing/2015/10/21/chartex" xmlns:cx3="http://schemas.microsoft.com/office/drawing/2016/5/9/chartex" xmlns:cx4="http://schemas.microsoft.com/office/drawing/2016/5/10/chartex" xmlns:cx5="http://schemas.microsoft.com/office/drawing/2016/5/11/chartex" xmlns:cx6="http://schemas.microsoft.com/office/drawing/2016/5/12/chartex" xmlns:cx7="http://schemas.microsoft.com/office/drawing/2016/5/13/chartex" xmlns:cx8="http://schemas.microsoft.com/office/drawing/2016/5/14/chartex" xmlns:mc="http://schemas.openxmlformats.org/markup-compatibility/2006" xmlns:aink="http://schemas.microsoft.com/office/drawing/2016/ink" xmlns:am3d="http://schemas.microsoft.com/office/drawing/2017/model3d" xmlns:o="urn:schemas-microsoft-com:office:office" xmlns:oel="http://schemas.microsoft.com/office/2019/extlst" xmlns:r="http://schemas.openxmlformats.org/officeDocument/2006/relationships" xmlns:m="http://schemas.openxmlformats.org/officeDocument/2006/math" xmlns:v="urn:schemas-microsoft-com:vml" xmlns:wp14="http://schemas.microsoft.com/office/word/2010/wordprocessingDrawing" xmlns:wp="http://schemas.openxmlformats.org/drawingml/2006/wordprocessingDrawing" xmlns:w10="urn:schemas-microsoft-com:office:word" xmlns:w="http://schemas.openxmlformats.org/wordprocessingml/2006/main" xmlns:w14="http://schemas.microsoft.com/office/word/2010/wordml" xmlns:w15="http://schemas.microsoft.com/office/word/2012/wordml" xmlns:w16cex="http://schemas.microsoft.com/office/word/2018/wordml/cex" xmlns:w16cid="http://schemas.microsoft.com/office/word/2016/wordml/cid" xmlns:w16="http://schemas.microsoft.com/office/word/2018/wordml" xmlns:w16du="http://schemas.microsoft.com/office/word/2023/wordml/word16du" xmlns:w16sdtdh="http://schemas.microsoft.com/office/word/2020/wordml/sdtdatahash" xmlns:w16sdtfl="http://schemas.microsoft.com/office/word/2024/wordml/sdtformatlock" xmlns:w16se="http://schemas.microsoft.com/office/word/2015/wordml/symex" xmlns:wpg="http://schemas.microsoft.com/office/word/2010/wordprocessingGroup" xmlns:wpi="http://schemas.microsoft.com/office/word/2010/wordprocessingInk" xmlns:wne="http://schemas.microsoft.com/office/word/2006/wordml" xmlns:wps="http://schemas.microsoft.com/office/word/2010/wordprocessingShape" mc:Ignorable="w14 w15 w16se w16cid w16 w16cex w16sdtdh w16sdtfl w16du wp14">
   <w:endnote w:type="separator" w:id="-1">
     <w:p>
       <w:pPr>
@@ -2096,17 +1959,7 @@
 </file>
 
 <file path=word/footer1.xml><?xml version="1.0" encoding="utf-8"?>
-<w:ftr xmlns:wpc="http://schemas.microsoft.com/office/word/2010/wordprocessingCanvas" xmlns:cx="http://schemas.microsoft.com/office/drawing/2014/chartex" xmlns:cx1="http://schemas.microsoft.com/office/drawing/2015/9/8/chartex" xmlns:cx2="http://schemas.microsoft.com/office/drawing/2015/10/21/chartex" xmlns:cx3="http://schemas.microsoft.com/office/drawing/2016/5/9/chartex" xmlns:cx4="http://schemas.microsoft.com/office/drawing/2016/5/10/chartex" xmlns:cx5="http://schemas.microsoft.com/office/drawing/2016/5/11/chartex" xmlns:cx6="http://schemas.microsoft.com/office/drawing/2016/5/12/chartex" xmlns:cx7="http://schemas.microsoft.com/office/drawing/2016/5/13/chartex" xmlns:cx8="http://schemas.microsoft.com/office/drawing/2016/5/14/chartex" xmlns:mc="http://schemas.openxmlformats.org/markup-compatibility/2006" xmlns:aink="http://schemas.microsoft.com/office/drawing/2016/ink" xmlns:am3d="http://schemas.microsoft.com/office/drawing/2017/model3d" xmlns:o="urn:schemas-microsoft-com:office:office" xmlns:oel="http://schemas.microsoft.com/office/2019/extlst" xmlns:r="http://schemas.openxmlformats.org/officeDocument/2006/relationships" xmlns:m="http://schemas.openxmlformats.org/officeDocument/2006/math" xmlns:v="urn:schemas-microsoft-com:vml" xmlns:wp14="http://schemas.microsoft.com/office/word/2010/wordprocessingDrawing" xmlns:wp="http://schemas.openxmlformats.org/drawingml/2006/wordprocessingDrawing" xmlns:w10="urn:schemas-microsoft-com:office:word" xmlns:w="http://schemas.openxmlformats.org/wordprocessingml/2006/main" xmlns:w14="http://schemas.microsoft.com/office/word/2010/wordml" xmlns:w15="http://schemas.microsoft.com/office/word/2012/wordml" xmlns:w16cex="http://schemas.microsoft.com/office/word/2018/wordml/cex" xmlns:w16cid="http://schemas.microsoft.com/office/word/2016/wordml/cid" xmlns:w16="http://schemas.microsoft.com/office/word/2018/wordml" xmlns:w16du="http://schemas.microsoft.com/office/word/2023/wordml/word16du" xmlns:w16sdtdh="http://schemas.microsoft.com/office/word/2020/wordml/sdtdatahash" xmlns:w16se="http://schemas.microsoft.com/office/word/2015/wordml/symex" xmlns:wpg="http://schemas.microsoft.com/office/word/2010/wordprocessingGroup" xmlns:wpi="http://schemas.microsoft.com/office/word/2010/wordprocessingInk" xmlns:wne="http://schemas.microsoft.com/office/word/2006/wordml" xmlns:wps="http://schemas.microsoft.com/office/word/2010/wordprocessingShape" mc:Ignorable="w14 w15 w16se w16cid w16 w16cex w16sdtdh w16du wp14">
-  <w:p>
-    <w:pPr>
-      <w:pStyle w:val="Pieddepage"/>
-    </w:pPr>
-  </w:p>
-</w:ftr>
-</file>
-
-<file path=word/footer2.xml><?xml version="1.0" encoding="utf-8"?>
-<w:ftr xmlns:wpc="http://schemas.microsoft.com/office/word/2010/wordprocessingCanvas" xmlns:cx="http://schemas.microsoft.com/office/drawing/2014/chartex" xmlns:cx1="http://schemas.microsoft.com/office/drawing/2015/9/8/chartex" xmlns:cx2="http://schemas.microsoft.com/office/drawing/2015/10/21/chartex" xmlns:cx3="http://schemas.microsoft.com/office/drawing/2016/5/9/chartex" xmlns:cx4="http://schemas.microsoft.com/office/drawing/2016/5/10/chartex" xmlns:cx5="http://schemas.microsoft.com/office/drawing/2016/5/11/chartex" xmlns:cx6="http://schemas.microsoft.com/office/drawing/2016/5/12/chartex" xmlns:cx7="http://schemas.microsoft.com/office/drawing/2016/5/13/chartex" xmlns:cx8="http://schemas.microsoft.com/office/drawing/2016/5/14/chartex" xmlns:mc="http://schemas.openxmlformats.org/markup-compatibility/2006" xmlns:aink="http://schemas.microsoft.com/office/drawing/2016/ink" xmlns:am3d="http://schemas.microsoft.com/office/drawing/2017/model3d" xmlns:o="urn:schemas-microsoft-com:office:office" xmlns:oel="http://schemas.microsoft.com/office/2019/extlst" xmlns:r="http://schemas.openxmlformats.org/officeDocument/2006/relationships" xmlns:m="http://schemas.openxmlformats.org/officeDocument/2006/math" xmlns:v="urn:schemas-microsoft-com:vml" xmlns:wp14="http://schemas.microsoft.com/office/word/2010/wordprocessingDrawing" xmlns:wp="http://schemas.openxmlformats.org/drawingml/2006/wordprocessingDrawing" xmlns:w10="urn:schemas-microsoft-com:office:word" xmlns:w="http://schemas.openxmlformats.org/wordprocessingml/2006/main" xmlns:w14="http://schemas.microsoft.com/office/word/2010/wordml" xmlns:w15="http://schemas.microsoft.com/office/word/2012/wordml" xmlns:w16cex="http://schemas.microsoft.com/office/word/2018/wordml/cex" xmlns:w16cid="http://schemas.microsoft.com/office/word/2016/wordml/cid" xmlns:w16="http://schemas.microsoft.com/office/word/2018/wordml" xmlns:w16du="http://schemas.microsoft.com/office/word/2023/wordml/word16du" xmlns:w16sdtdh="http://schemas.microsoft.com/office/word/2020/wordml/sdtdatahash" xmlns:w16se="http://schemas.microsoft.com/office/word/2015/wordml/symex" xmlns:wpg="http://schemas.microsoft.com/office/word/2010/wordprocessingGroup" xmlns:wpi="http://schemas.microsoft.com/office/word/2010/wordprocessingInk" xmlns:wne="http://schemas.microsoft.com/office/word/2006/wordml" xmlns:wps="http://schemas.microsoft.com/office/word/2010/wordprocessingShape" mc:Ignorable="w14 w15 w16se w16cid w16 w16cex w16sdtdh w16du wp14">
+<w:ftr xmlns:wpc="http://schemas.microsoft.com/office/word/2010/wordprocessingCanvas" xmlns:cx="http://schemas.microsoft.com/office/drawing/2014/chartex" xmlns:cx1="http://schemas.microsoft.com/office/drawing/2015/9/8/chartex" xmlns:cx2="http://schemas.microsoft.com/office/drawing/2015/10/21/chartex" xmlns:cx3="http://schemas.microsoft.com/office/drawing/2016/5/9/chartex" xmlns:cx4="http://schemas.microsoft.com/office/drawing/2016/5/10/chartex" xmlns:cx5="http://schemas.microsoft.com/office/drawing/2016/5/11/chartex" xmlns:cx6="http://schemas.microsoft.com/office/drawing/2016/5/12/chartex" xmlns:cx7="http://schemas.microsoft.com/office/drawing/2016/5/13/chartex" xmlns:cx8="http://schemas.microsoft.com/office/drawing/2016/5/14/chartex" xmlns:mc="http://schemas.openxmlformats.org/markup-compatibility/2006" xmlns:aink="http://schemas.microsoft.com/office/drawing/2016/ink" xmlns:am3d="http://schemas.microsoft.com/office/drawing/2017/model3d" xmlns:o="urn:schemas-microsoft-com:office:office" xmlns:oel="http://schemas.microsoft.com/office/2019/extlst" xmlns:r="http://schemas.openxmlformats.org/officeDocument/2006/relationships" xmlns:m="http://schemas.openxmlformats.org/officeDocument/2006/math" xmlns:v="urn:schemas-microsoft-com:vml" xmlns:wp14="http://schemas.microsoft.com/office/word/2010/wordprocessingDrawing" xmlns:wp="http://schemas.openxmlformats.org/drawingml/2006/wordprocessingDrawing" xmlns:w10="urn:schemas-microsoft-com:office:word" xmlns:w="http://schemas.openxmlformats.org/wordprocessingml/2006/main" xmlns:w14="http://schemas.microsoft.com/office/word/2010/wordml" xmlns:w15="http://schemas.microsoft.com/office/word/2012/wordml" xmlns:w16cex="http://schemas.microsoft.com/office/word/2018/wordml/cex" xmlns:w16cid="http://schemas.microsoft.com/office/word/2016/wordml/cid" xmlns:w16="http://schemas.microsoft.com/office/word/2018/wordml" xmlns:w16du="http://schemas.microsoft.com/office/word/2023/wordml/word16du" xmlns:w16sdtdh="http://schemas.microsoft.com/office/word/2020/wordml/sdtdatahash" xmlns:w16sdtfl="http://schemas.microsoft.com/office/word/2024/wordml/sdtformatlock" xmlns:w16se="http://schemas.microsoft.com/office/word/2015/wordml/symex" xmlns:wpg="http://schemas.microsoft.com/office/word/2010/wordprocessingGroup" xmlns:wpi="http://schemas.microsoft.com/office/word/2010/wordprocessingInk" xmlns:wne="http://schemas.microsoft.com/office/word/2006/wordml" xmlns:wps="http://schemas.microsoft.com/office/word/2010/wordprocessingShape" mc:Ignorable="w14 w15 w16se w16cid w16 w16cex w16sdtdh w16sdtfl w16du wp14">
   <w:sdt>
     <w:sdtPr>
       <w:id w:val="1245224983"/>
@@ -2150,18 +2003,8 @@
 </w:ftr>
 </file>
 
-<file path=word/footer3.xml><?xml version="1.0" encoding="utf-8"?>
-<w:ftr xmlns:wpc="http://schemas.microsoft.com/office/word/2010/wordprocessingCanvas" xmlns:cx="http://schemas.microsoft.com/office/drawing/2014/chartex" xmlns:cx1="http://schemas.microsoft.com/office/drawing/2015/9/8/chartex" xmlns:cx2="http://schemas.microsoft.com/office/drawing/2015/10/21/chartex" xmlns:cx3="http://schemas.microsoft.com/office/drawing/2016/5/9/chartex" xmlns:cx4="http://schemas.microsoft.com/office/drawing/2016/5/10/chartex" xmlns:cx5="http://schemas.microsoft.com/office/drawing/2016/5/11/chartex" xmlns:cx6="http://schemas.microsoft.com/office/drawing/2016/5/12/chartex" xmlns:cx7="http://schemas.microsoft.com/office/drawing/2016/5/13/chartex" xmlns:cx8="http://schemas.microsoft.com/office/drawing/2016/5/14/chartex" xmlns:mc="http://schemas.openxmlformats.org/markup-compatibility/2006" xmlns:aink="http://schemas.microsoft.com/office/drawing/2016/ink" xmlns:am3d="http://schemas.microsoft.com/office/drawing/2017/model3d" xmlns:o="urn:schemas-microsoft-com:office:office" xmlns:oel="http://schemas.microsoft.com/office/2019/extlst" xmlns:r="http://schemas.openxmlformats.org/officeDocument/2006/relationships" xmlns:m="http://schemas.openxmlformats.org/officeDocument/2006/math" xmlns:v="urn:schemas-microsoft-com:vml" xmlns:wp14="http://schemas.microsoft.com/office/word/2010/wordprocessingDrawing" xmlns:wp="http://schemas.openxmlformats.org/drawingml/2006/wordprocessingDrawing" xmlns:w10="urn:schemas-microsoft-com:office:word" xmlns:w="http://schemas.openxmlformats.org/wordprocessingml/2006/main" xmlns:w14="http://schemas.microsoft.com/office/word/2010/wordml" xmlns:w15="http://schemas.microsoft.com/office/word/2012/wordml" xmlns:w16cex="http://schemas.microsoft.com/office/word/2018/wordml/cex" xmlns:w16cid="http://schemas.microsoft.com/office/word/2016/wordml/cid" xmlns:w16="http://schemas.microsoft.com/office/word/2018/wordml" xmlns:w16du="http://schemas.microsoft.com/office/word/2023/wordml/word16du" xmlns:w16sdtdh="http://schemas.microsoft.com/office/word/2020/wordml/sdtdatahash" xmlns:w16se="http://schemas.microsoft.com/office/word/2015/wordml/symex" xmlns:wpg="http://schemas.microsoft.com/office/word/2010/wordprocessingGroup" xmlns:wpi="http://schemas.microsoft.com/office/word/2010/wordprocessingInk" xmlns:wne="http://schemas.microsoft.com/office/word/2006/wordml" xmlns:wps="http://schemas.microsoft.com/office/word/2010/wordprocessingShape" mc:Ignorable="w14 w15 w16se w16cid w16 w16cex w16sdtdh w16du wp14">
-  <w:p>
-    <w:pPr>
-      <w:pStyle w:val="Pieddepage"/>
-    </w:pPr>
-  </w:p>
-</w:ftr>
-</file>
-
 <file path=word/footnotes.xml><?xml version="1.0" encoding="utf-8"?>
-<w:footnotes xmlns:wpc="http://schemas.microsoft.com/office/word/2010/wordprocessingCanvas" xmlns:cx="http://schemas.microsoft.com/office/drawing/2014/chartex" xmlns:cx1="http://schemas.microsoft.com/office/drawing/2015/9/8/chartex" xmlns:cx2="http://schemas.microsoft.com/office/drawing/2015/10/21/chartex" xmlns:cx3="http://schemas.microsoft.com/office/drawing/2016/5/9/chartex" xmlns:cx4="http://schemas.microsoft.com/office/drawing/2016/5/10/chartex" xmlns:cx5="http://schemas.microsoft.com/office/drawing/2016/5/11/chartex" xmlns:cx6="http://schemas.microsoft.com/office/drawing/2016/5/12/chartex" xmlns:cx7="http://schemas.microsoft.com/office/drawing/2016/5/13/chartex" xmlns:cx8="http://schemas.microsoft.com/office/drawing/2016/5/14/chartex" xmlns:mc="http://schemas.openxmlformats.org/markup-compatibility/2006" xmlns:aink="http://schemas.microsoft.com/office/drawing/2016/ink" xmlns:am3d="http://schemas.microsoft.com/office/drawing/2017/model3d" xmlns:o="urn:schemas-microsoft-com:office:office" xmlns:oel="http://schemas.microsoft.com/office/2019/extlst" xmlns:r="http://schemas.openxmlformats.org/officeDocument/2006/relationships" xmlns:m="http://schemas.openxmlformats.org/officeDocument/2006/math" xmlns:v="urn:schemas-microsoft-com:vml" xmlns:wp14="http://schemas.microsoft.com/office/word/2010/wordprocessingDrawing" xmlns:wp="http://schemas.openxmlformats.org/drawingml/2006/wordprocessingDrawing" xmlns:w10="urn:schemas-microsoft-com:office:word" xmlns:w="http://schemas.openxmlformats.org/wordprocessingml/2006/main" xmlns:w14="http://schemas.microsoft.com/office/word/2010/wordml" xmlns:w15="http://schemas.microsoft.com/office/word/2012/wordml" xmlns:w16cex="http://schemas.microsoft.com/office/word/2018/wordml/cex" xmlns:w16cid="http://schemas.microsoft.com/office/word/2016/wordml/cid" xmlns:w16="http://schemas.microsoft.com/office/word/2018/wordml" xmlns:w16du="http://schemas.microsoft.com/office/word/2023/wordml/word16du" xmlns:w16sdtdh="http://schemas.microsoft.com/office/word/2020/wordml/sdtdatahash" xmlns:w16se="http://schemas.microsoft.com/office/word/2015/wordml/symex" xmlns:wpg="http://schemas.microsoft.com/office/word/2010/wordprocessingGroup" xmlns:wpi="http://schemas.microsoft.com/office/word/2010/wordprocessingInk" xmlns:wne="http://schemas.microsoft.com/office/word/2006/wordml" xmlns:wps="http://schemas.microsoft.com/office/word/2010/wordprocessingShape" mc:Ignorable="w14 w15 w16se w16cid w16 w16cex w16sdtdh w16du wp14">
+<w:footnotes xmlns:wpc="http://schemas.microsoft.com/office/word/2010/wordprocessingCanvas" xmlns:cx="http://schemas.microsoft.com/office/drawing/2014/chartex" xmlns:cx1="http://schemas.microsoft.com/office/drawing/2015/9/8/chartex" xmlns:cx2="http://schemas.microsoft.com/office/drawing/2015/10/21/chartex" xmlns:cx3="http://schemas.microsoft.com/office/drawing/2016/5/9/chartex" xmlns:cx4="http://schemas.microsoft.com/office/drawing/2016/5/10/chartex" xmlns:cx5="http://schemas.microsoft.com/office/drawing/2016/5/11/chartex" xmlns:cx6="http://schemas.microsoft.com/office/drawing/2016/5/12/chartex" xmlns:cx7="http://schemas.microsoft.com/office/drawing/2016/5/13/chartex" xmlns:cx8="http://schemas.microsoft.com/office/drawing/2016/5/14/chartex" xmlns:mc="http://schemas.openxmlformats.org/markup-compatibility/2006" xmlns:aink="http://schemas.microsoft.com/office/drawing/2016/ink" xmlns:am3d="http://schemas.microsoft.com/office/drawing/2017/model3d" xmlns:o="urn:schemas-microsoft-com:office:office" xmlns:oel="http://schemas.microsoft.com/office/2019/extlst" xmlns:r="http://schemas.openxmlformats.org/officeDocument/2006/relationships" xmlns:m="http://schemas.openxmlformats.org/officeDocument/2006/math" xmlns:v="urn:schemas-microsoft-com:vml" xmlns:wp14="http://schemas.microsoft.com/office/word/2010/wordprocessingDrawing" xmlns:wp="http://schemas.openxmlformats.org/drawingml/2006/wordprocessingDrawing" xmlns:w10="urn:schemas-microsoft-com:office:word" xmlns:w="http://schemas.openxmlformats.org/wordprocessingml/2006/main" xmlns:w14="http://schemas.microsoft.com/office/word/2010/wordml" xmlns:w15="http://schemas.microsoft.com/office/word/2012/wordml" xmlns:w16cex="http://schemas.microsoft.com/office/word/2018/wordml/cex" xmlns:w16cid="http://schemas.microsoft.com/office/word/2016/wordml/cid" xmlns:w16="http://schemas.microsoft.com/office/word/2018/wordml" xmlns:w16du="http://schemas.microsoft.com/office/word/2023/wordml/word16du" xmlns:w16sdtdh="http://schemas.microsoft.com/office/word/2020/wordml/sdtdatahash" xmlns:w16sdtfl="http://schemas.microsoft.com/office/word/2024/wordml/sdtformatlock" xmlns:w16se="http://schemas.microsoft.com/office/word/2015/wordml/symex" xmlns:wpg="http://schemas.microsoft.com/office/word/2010/wordprocessingGroup" xmlns:wpi="http://schemas.microsoft.com/office/word/2010/wordprocessingInk" xmlns:wne="http://schemas.microsoft.com/office/word/2006/wordml" xmlns:wps="http://schemas.microsoft.com/office/word/2010/wordprocessingShape" mc:Ignorable="w14 w15 w16se w16cid w16 w16cex w16sdtdh w16sdtfl w16du wp14">
   <w:footnote w:type="separator" w:id="-1">
     <w:p>
       <w:pPr>
@@ -2186,17 +2029,7 @@
 </file>
 
 <file path=word/header1.xml><?xml version="1.0" encoding="utf-8"?>
-<w:hdr xmlns:wpc="http://schemas.microsoft.com/office/word/2010/wordprocessingCanvas" xmlns:cx="http://schemas.microsoft.com/office/drawing/2014/chartex" xmlns:cx1="http://schemas.microsoft.com/office/drawing/2015/9/8/chartex" xmlns:cx2="http://schemas.microsoft.com/office/drawing/2015/10/21/chartex" xmlns:cx3="http://schemas.microsoft.com/office/drawing/2016/5/9/chartex" xmlns:cx4="http://schemas.microsoft.com/office/drawing/2016/5/10/chartex" xmlns:cx5="http://schemas.microsoft.com/office/drawing/2016/5/11/chartex" xmlns:cx6="http://schemas.microsoft.com/office/drawing/2016/5/12/chartex" xmlns:cx7="http://schemas.microsoft.com/office/drawing/2016/5/13/chartex" xmlns:cx8="http://schemas.microsoft.com/office/drawing/2016/5/14/chartex" xmlns:mc="http://schemas.openxmlformats.org/markup-compatibility/2006" xmlns:aink="http://schemas.microsoft.com/office/drawing/2016/ink" xmlns:am3d="http://schemas.microsoft.com/office/drawing/2017/model3d" xmlns:o="urn:schemas-microsoft-com:office:office" xmlns:oel="http://schemas.microsoft.com/office/2019/extlst" xmlns:r="http://schemas.openxmlformats.org/officeDocument/2006/relationships" xmlns:m="http://schemas.openxmlformats.org/officeDocument/2006/math" xmlns:v="urn:schemas-microsoft-com:vml" xmlns:wp14="http://schemas.microsoft.com/office/word/2010/wordprocessingDrawing" xmlns:wp="http://schemas.openxmlformats.org/drawingml/2006/wordprocessingDrawing" xmlns:w10="urn:schemas-microsoft-com:office:word" xmlns:w="http://schemas.openxmlformats.org/wordprocessingml/2006/main" xmlns:w14="http://schemas.microsoft.com/office/word/2010/wordml" xmlns:w15="http://schemas.microsoft.com/office/word/2012/wordml" xmlns:w16cex="http://schemas.microsoft.com/office/word/2018/wordml/cex" xmlns:w16cid="http://schemas.microsoft.com/office/word/2016/wordml/cid" xmlns:w16="http://schemas.microsoft.com/office/word/2018/wordml" xmlns:w16du="http://schemas.microsoft.com/office/word/2023/wordml/word16du" xmlns:w16sdtdh="http://schemas.microsoft.com/office/word/2020/wordml/sdtdatahash" xmlns:w16se="http://schemas.microsoft.com/office/word/2015/wordml/symex" xmlns:wpg="http://schemas.microsoft.com/office/word/2010/wordprocessingGroup" xmlns:wpi="http://schemas.microsoft.com/office/word/2010/wordprocessingInk" xmlns:wne="http://schemas.microsoft.com/office/word/2006/wordml" xmlns:wps="http://schemas.microsoft.com/office/word/2010/wordprocessingShape" mc:Ignorable="w14 w15 w16se w16cid w16 w16cex w16sdtdh w16du wp14">
-  <w:p>
-    <w:pPr>
-      <w:pStyle w:val="En-tte"/>
-    </w:pPr>
-  </w:p>
-</w:hdr>
-</file>
-
-<file path=word/header2.xml><?xml version="1.0" encoding="utf-8"?>
-<w:hdr xmlns:wpc="http://schemas.microsoft.com/office/word/2010/wordprocessingCanvas" xmlns:cx="http://schemas.microsoft.com/office/drawing/2014/chartex" xmlns:cx1="http://schemas.microsoft.com/office/drawing/2015/9/8/chartex" xmlns:cx2="http://schemas.microsoft.com/office/drawing/2015/10/21/chartex" xmlns:cx3="http://schemas.microsoft.com/office/drawing/2016/5/9/chartex" xmlns:cx4="http://schemas.microsoft.com/office/drawing/2016/5/10/chartex" xmlns:cx5="http://schemas.microsoft.com/office/drawing/2016/5/11/chartex" xmlns:cx6="http://schemas.microsoft.com/office/drawing/2016/5/12/chartex" xmlns:cx7="http://schemas.microsoft.com/office/drawing/2016/5/13/chartex" xmlns:cx8="http://schemas.microsoft.com/office/drawing/2016/5/14/chartex" xmlns:mc="http://schemas.openxmlformats.org/markup-compatibility/2006" xmlns:aink="http://schemas.microsoft.com/office/drawing/2016/ink" xmlns:am3d="http://schemas.microsoft.com/office/drawing/2017/model3d" xmlns:o="urn:schemas-microsoft-com:office:office" xmlns:oel="http://schemas.microsoft.com/office/2019/extlst" xmlns:r="http://schemas.openxmlformats.org/officeDocument/2006/relationships" xmlns:m="http://schemas.openxmlformats.org/officeDocument/2006/math" xmlns:v="urn:schemas-microsoft-com:vml" xmlns:wp14="http://schemas.microsoft.com/office/word/2010/wordprocessingDrawing" xmlns:wp="http://schemas.openxmlformats.org/drawingml/2006/wordprocessingDrawing" xmlns:w10="urn:schemas-microsoft-com:office:word" xmlns:w="http://schemas.openxmlformats.org/wordprocessingml/2006/main" xmlns:w14="http://schemas.microsoft.com/office/word/2010/wordml" xmlns:w15="http://schemas.microsoft.com/office/word/2012/wordml" xmlns:w16cex="http://schemas.microsoft.com/office/word/2018/wordml/cex" xmlns:w16cid="http://schemas.microsoft.com/office/word/2016/wordml/cid" xmlns:w16="http://schemas.microsoft.com/office/word/2018/wordml" xmlns:w16du="http://schemas.microsoft.com/office/word/2023/wordml/word16du" xmlns:w16sdtdh="http://schemas.microsoft.com/office/word/2020/wordml/sdtdatahash" xmlns:w16se="http://schemas.microsoft.com/office/word/2015/wordml/symex" xmlns:wpg="http://schemas.microsoft.com/office/word/2010/wordprocessingGroup" xmlns:wpi="http://schemas.microsoft.com/office/word/2010/wordprocessingInk" xmlns:wne="http://schemas.microsoft.com/office/word/2006/wordml" xmlns:wps="http://schemas.microsoft.com/office/word/2010/wordprocessingShape" mc:Ignorable="w14 w15 w16se w16cid w16 w16cex w16sdtdh w16du wp14">
+<w:hdr xmlns:wpc="http://schemas.microsoft.com/office/word/2010/wordprocessingCanvas" xmlns:cx="http://schemas.microsoft.com/office/drawing/2014/chartex" xmlns:cx1="http://schemas.microsoft.com/office/drawing/2015/9/8/chartex" xmlns:cx2="http://schemas.microsoft.com/office/drawing/2015/10/21/chartex" xmlns:cx3="http://schemas.microsoft.com/office/drawing/2016/5/9/chartex" xmlns:cx4="http://schemas.microsoft.com/office/drawing/2016/5/10/chartex" xmlns:cx5="http://schemas.microsoft.com/office/drawing/2016/5/11/chartex" xmlns:cx6="http://schemas.microsoft.com/office/drawing/2016/5/12/chartex" xmlns:cx7="http://schemas.microsoft.com/office/drawing/2016/5/13/chartex" xmlns:cx8="http://schemas.microsoft.com/office/drawing/2016/5/14/chartex" xmlns:mc="http://schemas.openxmlformats.org/markup-compatibility/2006" xmlns:aink="http://schemas.microsoft.com/office/drawing/2016/ink" xmlns:am3d="http://schemas.microsoft.com/office/drawing/2017/model3d" xmlns:o="urn:schemas-microsoft-com:office:office" xmlns:oel="http://schemas.microsoft.com/office/2019/extlst" xmlns:r="http://schemas.openxmlformats.org/officeDocument/2006/relationships" xmlns:m="http://schemas.openxmlformats.org/officeDocument/2006/math" xmlns:v="urn:schemas-microsoft-com:vml" xmlns:wp14="http://schemas.microsoft.com/office/word/2010/wordprocessingDrawing" xmlns:wp="http://schemas.openxmlformats.org/drawingml/2006/wordprocessingDrawing" xmlns:w10="urn:schemas-microsoft-com:office:word" xmlns:w="http://schemas.openxmlformats.org/wordprocessingml/2006/main" xmlns:w14="http://schemas.microsoft.com/office/word/2010/wordml" xmlns:w15="http://schemas.microsoft.com/office/word/2012/wordml" xmlns:w16cex="http://schemas.microsoft.com/office/word/2018/wordml/cex" xmlns:w16cid="http://schemas.microsoft.com/office/word/2016/wordml/cid" xmlns:w16="http://schemas.microsoft.com/office/word/2018/wordml" xmlns:w16du="http://schemas.microsoft.com/office/word/2023/wordml/word16du" xmlns:w16sdtdh="http://schemas.microsoft.com/office/word/2020/wordml/sdtdatahash" xmlns:w16sdtfl="http://schemas.microsoft.com/office/word/2024/wordml/sdtformatlock" xmlns:w16se="http://schemas.microsoft.com/office/word/2015/wordml/symex" xmlns:wpg="http://schemas.microsoft.com/office/word/2010/wordprocessingGroup" xmlns:wpi="http://schemas.microsoft.com/office/word/2010/wordprocessingInk" xmlns:wne="http://schemas.microsoft.com/office/word/2006/wordml" xmlns:wps="http://schemas.microsoft.com/office/word/2010/wordprocessingShape" mc:Ignorable="w14 w15 w16se w16cid w16 w16cex w16sdtdh w16sdtfl w16du wp14">
   <w:p>
     <w:pPr>
       <w:pStyle w:val="En-tte"/>
@@ -2212,7 +2045,31 @@
         <w:szCs w:val="18"/>
         <w:lang w:val="fr-CA"/>
       </w:rPr>
-      <w:t>420-2S5-H25</w:t>
+      <w:t>420-2</w:t>
+    </w:r>
+    <w:r>
+      <w:rPr>
+        <w:sz w:val="16"/>
+        <w:szCs w:val="18"/>
+        <w:lang w:val="fr-CA"/>
+      </w:rPr>
+      <w:t>X</w:t>
+    </w:r>
+    <w:r>
+      <w:rPr>
+        <w:sz w:val="16"/>
+        <w:szCs w:val="18"/>
+        <w:lang w:val="fr-CA"/>
+      </w:rPr>
+      <w:t>5-H2</w:t>
+    </w:r>
+    <w:r>
+      <w:rPr>
+        <w:sz w:val="16"/>
+        <w:szCs w:val="18"/>
+        <w:lang w:val="fr-CA"/>
+      </w:rPr>
+      <w:t>6</w:t>
     </w:r>
     <w:r>
       <w:rPr>
@@ -2233,6 +2090,13 @@
         <w:sz w:val="16"/>
         <w:szCs w:val="18"/>
       </w:rPr>
+      <w:t xml:space="preserve"> &amp; Victor Delia</w:t>
+    </w:r>
+    <w:r>
+      <w:rPr>
+        <w:sz w:val="16"/>
+        <w:szCs w:val="18"/>
+      </w:rPr>
       <w:ptab w:relativeTo="margin" w:alignment="right" w:leader="none"/>
     </w:r>
     <w:r>
@@ -2246,18 +2110,8 @@
 </w:hdr>
 </file>
 
-<file path=word/header3.xml><?xml version="1.0" encoding="utf-8"?>
-<w:hdr xmlns:wpc="http://schemas.microsoft.com/office/word/2010/wordprocessingCanvas" xmlns:cx="http://schemas.microsoft.com/office/drawing/2014/chartex" xmlns:cx1="http://schemas.microsoft.com/office/drawing/2015/9/8/chartex" xmlns:cx2="http://schemas.microsoft.com/office/drawing/2015/10/21/chartex" xmlns:cx3="http://schemas.microsoft.com/office/drawing/2016/5/9/chartex" xmlns:cx4="http://schemas.microsoft.com/office/drawing/2016/5/10/chartex" xmlns:cx5="http://schemas.microsoft.com/office/drawing/2016/5/11/chartex" xmlns:cx6="http://schemas.microsoft.com/office/drawing/2016/5/12/chartex" xmlns:cx7="http://schemas.microsoft.com/office/drawing/2016/5/13/chartex" xmlns:cx8="http://schemas.microsoft.com/office/drawing/2016/5/14/chartex" xmlns:mc="http://schemas.openxmlformats.org/markup-compatibility/2006" xmlns:aink="http://schemas.microsoft.com/office/drawing/2016/ink" xmlns:am3d="http://schemas.microsoft.com/office/drawing/2017/model3d" xmlns:o="urn:schemas-microsoft-com:office:office" xmlns:oel="http://schemas.microsoft.com/office/2019/extlst" xmlns:r="http://schemas.openxmlformats.org/officeDocument/2006/relationships" xmlns:m="http://schemas.openxmlformats.org/officeDocument/2006/math" xmlns:v="urn:schemas-microsoft-com:vml" xmlns:wp14="http://schemas.microsoft.com/office/word/2010/wordprocessingDrawing" xmlns:wp="http://schemas.openxmlformats.org/drawingml/2006/wordprocessingDrawing" xmlns:w10="urn:schemas-microsoft-com:office:word" xmlns:w="http://schemas.openxmlformats.org/wordprocessingml/2006/main" xmlns:w14="http://schemas.microsoft.com/office/word/2010/wordml" xmlns:w15="http://schemas.microsoft.com/office/word/2012/wordml" xmlns:w16cex="http://schemas.microsoft.com/office/word/2018/wordml/cex" xmlns:w16cid="http://schemas.microsoft.com/office/word/2016/wordml/cid" xmlns:w16="http://schemas.microsoft.com/office/word/2018/wordml" xmlns:w16du="http://schemas.microsoft.com/office/word/2023/wordml/word16du" xmlns:w16sdtdh="http://schemas.microsoft.com/office/word/2020/wordml/sdtdatahash" xmlns:w16se="http://schemas.microsoft.com/office/word/2015/wordml/symex" xmlns:wpg="http://schemas.microsoft.com/office/word/2010/wordprocessingGroup" xmlns:wpi="http://schemas.microsoft.com/office/word/2010/wordprocessingInk" xmlns:wne="http://schemas.microsoft.com/office/word/2006/wordml" xmlns:wps="http://schemas.microsoft.com/office/word/2010/wordprocessingShape" mc:Ignorable="w14 w15 w16se w16cid w16 w16cex w16sdtdh w16du wp14">
-  <w:p>
-    <w:pPr>
-      <w:pStyle w:val="En-tte"/>
-    </w:pPr>
-  </w:p>
-</w:hdr>
-</file>
-
 <file path=word/numbering.xml><?xml version="1.0" encoding="utf-8"?>
-<w:numbering xmlns:wpc="http://schemas.microsoft.com/office/word/2010/wordprocessingCanvas" xmlns:cx="http://schemas.microsoft.com/office/drawing/2014/chartex" xmlns:cx1="http://schemas.microsoft.com/office/drawing/2015/9/8/chartex" xmlns:cx2="http://schemas.microsoft.com/office/drawing/2015/10/21/chartex" xmlns:cx3="http://schemas.microsoft.com/office/drawing/2016/5/9/chartex" xmlns:cx4="http://schemas.microsoft.com/office/drawing/2016/5/10/chartex" xmlns:cx5="http://schemas.microsoft.com/office/drawing/2016/5/11/chartex" xmlns:cx6="http://schemas.microsoft.com/office/drawing/2016/5/12/chartex" xmlns:cx7="http://schemas.microsoft.com/office/drawing/2016/5/13/chartex" xmlns:cx8="http://schemas.microsoft.com/office/drawing/2016/5/14/chartex" xmlns:mc="http://schemas.openxmlformats.org/markup-compatibility/2006" xmlns:aink="http://schemas.microsoft.com/office/drawing/2016/ink" xmlns:am3d="http://schemas.microsoft.com/office/drawing/2017/model3d" xmlns:o="urn:schemas-microsoft-com:office:office" xmlns:oel="http://schemas.microsoft.com/office/2019/extlst" xmlns:r="http://schemas.openxmlformats.org/officeDocument/2006/relationships" xmlns:m="http://schemas.openxmlformats.org/officeDocument/2006/math" xmlns:v="urn:schemas-microsoft-com:vml" xmlns:wp14="http://schemas.microsoft.com/office/word/2010/wordprocessingDrawing" xmlns:wp="http://schemas.openxmlformats.org/drawingml/2006/wordprocessingDrawing" xmlns:w10="urn:schemas-microsoft-com:office:word" xmlns:w="http://schemas.openxmlformats.org/wordprocessingml/2006/main" xmlns:w14="http://schemas.microsoft.com/office/word/2010/wordml" xmlns:w15="http://schemas.microsoft.com/office/word/2012/wordml" xmlns:w16cex="http://schemas.microsoft.com/office/word/2018/wordml/cex" xmlns:w16cid="http://schemas.microsoft.com/office/word/2016/wordml/cid" xmlns:w16="http://schemas.microsoft.com/office/word/2018/wordml" xmlns:w16du="http://schemas.microsoft.com/office/word/2023/wordml/word16du" xmlns:w16sdtdh="http://schemas.microsoft.com/office/word/2020/wordml/sdtdatahash" xmlns:w16se="http://schemas.microsoft.com/office/word/2015/wordml/symex" xmlns:wpg="http://schemas.microsoft.com/office/word/2010/wordprocessingGroup" xmlns:wpi="http://schemas.microsoft.com/office/word/2010/wordprocessingInk" xmlns:wne="http://schemas.microsoft.com/office/word/2006/wordml" xmlns:wps="http://schemas.microsoft.com/office/word/2010/wordprocessingShape" mc:Ignorable="w14 w15 w16se w16cid w16 w16cex w16sdtdh w16du wp14">
+<w:numbering xmlns:wpc="http://schemas.microsoft.com/office/word/2010/wordprocessingCanvas" xmlns:cx="http://schemas.microsoft.com/office/drawing/2014/chartex" xmlns:cx1="http://schemas.microsoft.com/office/drawing/2015/9/8/chartex" xmlns:cx2="http://schemas.microsoft.com/office/drawing/2015/10/21/chartex" xmlns:cx3="http://schemas.microsoft.com/office/drawing/2016/5/9/chartex" xmlns:cx4="http://schemas.microsoft.com/office/drawing/2016/5/10/chartex" xmlns:cx5="http://schemas.microsoft.com/office/drawing/2016/5/11/chartex" xmlns:cx6="http://schemas.microsoft.com/office/drawing/2016/5/12/chartex" xmlns:cx7="http://schemas.microsoft.com/office/drawing/2016/5/13/chartex" xmlns:cx8="http://schemas.microsoft.com/office/drawing/2016/5/14/chartex" xmlns:mc="http://schemas.openxmlformats.org/markup-compatibility/2006" xmlns:aink="http://schemas.microsoft.com/office/drawing/2016/ink" xmlns:am3d="http://schemas.microsoft.com/office/drawing/2017/model3d" xmlns:o="urn:schemas-microsoft-com:office:office" xmlns:oel="http://schemas.microsoft.com/office/2019/extlst" xmlns:r="http://schemas.openxmlformats.org/officeDocument/2006/relationships" xmlns:m="http://schemas.openxmlformats.org/officeDocument/2006/math" xmlns:v="urn:schemas-microsoft-com:vml" xmlns:wp14="http://schemas.microsoft.com/office/word/2010/wordprocessingDrawing" xmlns:wp="http://schemas.openxmlformats.org/drawingml/2006/wordprocessingDrawing" xmlns:w10="urn:schemas-microsoft-com:office:word" xmlns:w="http://schemas.openxmlformats.org/wordprocessingml/2006/main" xmlns:w14="http://schemas.microsoft.com/office/word/2010/wordml" xmlns:w15="http://schemas.microsoft.com/office/word/2012/wordml" xmlns:w16cex="http://schemas.microsoft.com/office/word/2018/wordml/cex" xmlns:w16cid="http://schemas.microsoft.com/office/word/2016/wordml/cid" xmlns:w16="http://schemas.microsoft.com/office/word/2018/wordml" xmlns:w16du="http://schemas.microsoft.com/office/word/2023/wordml/word16du" xmlns:w16sdtdh="http://schemas.microsoft.com/office/word/2020/wordml/sdtdatahash" xmlns:w16sdtfl="http://schemas.microsoft.com/office/word/2024/wordml/sdtformatlock" xmlns:w16se="http://schemas.microsoft.com/office/word/2015/wordml/symex" xmlns:wpg="http://schemas.microsoft.com/office/word/2010/wordprocessingGroup" xmlns:wpi="http://schemas.microsoft.com/office/word/2010/wordprocessingInk" xmlns:wne="http://schemas.microsoft.com/office/word/2006/wordml" xmlns:wps="http://schemas.microsoft.com/office/word/2010/wordprocessingShape" mc:Ignorable="w14 w15 w16se w16cid w16 w16cex w16sdtdh w16sdtfl w16du wp14">
   <w:abstractNum w:abstractNumId="0" w15:restartNumberingAfterBreak="0">
     <w:nsid w:val="33981EC3"/>
     <w:multiLevelType w:val="hybridMultilevel"/>
@@ -2356,7 +2210,7 @@
 </file>
 
 <file path=word/styles.xml><?xml version="1.0" encoding="utf-8"?>
-<w:styles xmlns:mc="http://schemas.openxmlformats.org/markup-compatibility/2006" xmlns:r="http://schemas.openxmlformats.org/officeDocument/2006/relationships" xmlns:w="http://schemas.openxmlformats.org/wordprocessingml/2006/main" xmlns:w14="http://schemas.microsoft.com/office/word/2010/wordml" xmlns:w15="http://schemas.microsoft.com/office/word/2012/wordml" xmlns:w16cex="http://schemas.microsoft.com/office/word/2018/wordml/cex" xmlns:w16cid="http://schemas.microsoft.com/office/word/2016/wordml/cid" xmlns:w16="http://schemas.microsoft.com/office/word/2018/wordml" xmlns:w16du="http://schemas.microsoft.com/office/word/2023/wordml/word16du" xmlns:w16sdtdh="http://schemas.microsoft.com/office/word/2020/wordml/sdtdatahash" xmlns:w16se="http://schemas.microsoft.com/office/word/2015/wordml/symex" mc:Ignorable="w14 w15 w16se w16cid w16 w16cex w16sdtdh w16du">
+<w:styles xmlns:mc="http://schemas.openxmlformats.org/markup-compatibility/2006" xmlns:r="http://schemas.openxmlformats.org/officeDocument/2006/relationships" xmlns:w="http://schemas.openxmlformats.org/wordprocessingml/2006/main" xmlns:w14="http://schemas.microsoft.com/office/word/2010/wordml" xmlns:w15="http://schemas.microsoft.com/office/word/2012/wordml" xmlns:w16cex="http://schemas.microsoft.com/office/word/2018/wordml/cex" xmlns:w16cid="http://schemas.microsoft.com/office/word/2016/wordml/cid" xmlns:w16="http://schemas.microsoft.com/office/word/2018/wordml" xmlns:w16du="http://schemas.microsoft.com/office/word/2023/wordml/word16du" xmlns:w16sdtdh="http://schemas.microsoft.com/office/word/2020/wordml/sdtdatahash" xmlns:w16sdtfl="http://schemas.microsoft.com/office/word/2024/wordml/sdtformatlock" xmlns:w16se="http://schemas.microsoft.com/office/word/2015/wordml/symex" mc:Ignorable="w14 w15 w16se w16cid w16 w16cex w16sdtdh w16sdtfl w16du">
   <w:docDefaults>
     <w:rPrDefault>
       <w:rPr>

</xml_diff>